<commit_message>
Add nearby METAR choices and weather charts
</commit_message>
<xml_diff>
--- a/docs/manuel-utilisation-outils-de-vol.docx
+++ b/docs/manuel-utilisation-outils-de-vol.docx
@@ -5792,6 +5792,45 @@
     </w:p>
     <w:p>
       <w:pPr>
+        <w:pStyle w:val="ManualStep"/>
+        <w:numPr>
+          <w:ilvl w:val="0"/>
+          <w:numId w:val="18"/>
+        </w:numPr>
+      </w:pPr>
+      <w:r>
+        <w:rPr>
+          <w:rFonts w:ascii="Arial" w:hAnsi="Arial" w:eastAsia="Arial"/>
+          <w:b/>
+          <w:color w:val="172A34"/>
+          <w:sz w:val="19"/>
+        </w:rPr>
+        <w:t xml:space="preserve">Sans METAR local. </w:t>
+      </w:r>
+      <w:r>
+        <w:rPr>
+          <w:rFonts w:ascii="Arial" w:hAnsi="Arial" w:eastAsia="Arial"/>
+          <w:color w:val="172A34"/>
+          <w:sz w:val="19"/>
+        </w:rPr>
+        <w:t>choisir, si elle convient, l'une des deux observations voisines proposées. La distance, l'écart d'altitude et l'âge du METAR sont affichés. Aucune valeur voisine n'est appliquée sans ce choix explicite.</w:t>
+      </w:r>
+    </w:p>
+    <w:p>
+      <w:pPr>
+        <w:keepLines w:val="0"/>
+      </w:pPr>
+      <w:r>
+        <w:rPr>
+          <w:rFonts w:ascii="Arial" w:hAnsi="Arial" w:eastAsia="Arial"/>
+          <w:i w:val="0"/>
+          <w:color w:val="172A34"/>
+        </w:rPr>
+        <w:t>Le lien permanent « Ouvrir AÉROWEB » donne accès au portail officiel de Météo-France pour consulter les cartes TEMSI et WINTEM. Ces cartes complètent la préparation météo ; elles n'alimentent pas le calcul d'altitude-densité.</w:t>
+      </w:r>
+    </w:p>
+    <w:p>
+      <w:pPr>
         <w:pStyle w:val="Heading2"/>
       </w:pPr>
       <w:r>
@@ -6260,6 +6299,32 @@
           <w:sz w:val="19"/>
         </w:rPr>
         <w:t>contrôler l'heure et la station du METAR. Confirmer les conditions seulement après comparaison avec les observations disponibles au terrain.</w:t>
+      </w:r>
+    </w:p>
+    <w:p>
+      <w:pPr>
+        <w:pStyle w:val="ManualStep"/>
+        <w:numPr>
+          <w:ilvl w:val="0"/>
+          <w:numId w:val="19"/>
+        </w:numPr>
+      </w:pPr>
+      <w:r>
+        <w:rPr>
+          <w:rFonts w:ascii="Arial" w:hAnsi="Arial" w:eastAsia="Arial"/>
+          <w:b/>
+          <w:color w:val="172A34"/>
+          <w:sz w:val="19"/>
+        </w:rPr>
+        <w:t xml:space="preserve">TEMSI et WINTEM. </w:t>
+      </w:r>
+      <w:r>
+        <w:rPr>
+          <w:rFonts w:ascii="Arial" w:hAnsi="Arial" w:eastAsia="Arial"/>
+          <w:color w:val="172A34"/>
+          <w:sz w:val="19"/>
+        </w:rPr>
+        <w:t>ouvrir AÉROWEB depuis l'encadré permanent et consulter les cartes adaptées au vol. Elles ne modifient pas automatiquement les données de performance.</w:t>
       </w:r>
     </w:p>
     <w:p>
@@ -7001,7 +7066,33 @@
           <w:i w:val="0"/>
           <w:color w:val="172A34"/>
         </w:rPr>
-        <w:t>Le relais interroge Aviation Weather Center. Un METAR n'est utilisé que si la station retournée est celle demandée, si l'heure est cohérente, si l'observation a moins de deux heures et si QNH et température sont présents. Une station voisine prévue dans le jeu terrain est indiquée explicitement.</w:t>
+        <w:t>Le relais interroge Aviation Weather Center. Un METAR n'est utilisé que si la station retournée est celle demandée, si l'heure est cohérente, si l'observation a moins de deux heures et si QNH et température sont présents.</w:t>
+      </w:r>
+    </w:p>
+    <w:p>
+      <w:pPr>
+        <w:keepLines w:val="0"/>
+      </w:pPr>
+      <w:r>
+        <w:rPr>
+          <w:rFonts w:ascii="Arial" w:hAnsi="Arial" w:eastAsia="Arial"/>
+          <w:i w:val="0"/>
+          <w:color w:val="172A34"/>
+        </w:rPr>
+        <w:t>Si aucun METAR n'est publié pour le terrain, l'application recherche les observations récentes dans un rayon maximal de 150 km. Elle en présente deux au maximum, classées en tenant compte de la distance, de l'écart d'altitude et de la fraîcheur du rapport. Le pilote doit sélectionner la station : aucun METAR voisin n'est appliqué automatiquement.</w:t>
+      </w:r>
+    </w:p>
+    <w:p>
+      <w:pPr>
+        <w:keepLines w:val="0"/>
+      </w:pPr>
+      <w:r>
+        <w:rPr>
+          <w:rFonts w:ascii="Arial" w:hAnsi="Arial" w:eastAsia="Arial"/>
+          <w:i w:val="0"/>
+          <w:color w:val="172A34"/>
+        </w:rPr>
+        <w:t>Après sélection, l'avertissement « observation voisine » reste affiché. L'altitude conserve toujours la valeur du terrain demandé ; seules les données météorologiques proviennent de la station choisie. Pour les performances, le vent et la piste doivent être confirmés en tenant compte des conditions réellement observées au terrain.</w:t>
       </w:r>
     </w:p>
     <w:p>
@@ -7225,7 +7316,7 @@
     <w:p>
       <w:pPr>
         <w:pStyle w:val="Heading1"/>
-        <w:pageBreakBefore/>
+        <w:pageBreakBefore w:val="0"/>
         <w:spacing w:before="0" w:after="180"/>
       </w:pPr>
       <w:r>
@@ -8440,7 +8531,7 @@
                 <w:color w:val="172A34"/>
                 <w:sz w:val="15"/>
               </w:rPr>
-              <w:t>Les données physiques restent utilisables.</w:t>
+              <w:t>Deux observations voisines au maximum peuvent être proposées.</w:t>
             </w:r>
           </w:p>
         </w:tc>
@@ -8473,7 +8564,7 @@
                 <w:color w:val="172A34"/>
                 <w:sz w:val="15"/>
               </w:rPr>
-              <w:t>Saisir QNH, température, rosée et vent après contrôle.</w:t>
+              <w:t>Choisir explicitement une station adaptée ou poursuivre en saisie manuelle.</w:t>
             </w:r>
           </w:p>
         </w:tc>
@@ -8544,7 +8635,7 @@
                 <w:color w:val="172A34"/>
                 <w:sz w:val="15"/>
               </w:rPr>
-              <w:t>La station est signalée comme voisine.</w:t>
+              <w:t>La station et l'avertissement restent visibles.</w:t>
             </w:r>
           </w:p>
         </w:tc>
@@ -14839,9 +14930,33 @@
           <w:color w:val="172A34"/>
           <w:sz w:val="17"/>
         </w:rPr>
+        <w:t xml:space="preserve">Météo-France - AÉROWEB, cartes TEMSI et WINTEM : </w:t>
+      </w:r>
+      <w:hyperlink r:id="rId20">
+        <w:r>
+          <w:rPr>
+            <w:color w:val="087F70"/>
+            <w:u w:val="single"/>
+            <w:rFonts w:ascii="Arial" w:hAnsi="Arial"/>
+          </w:rPr>
+          <w:t>aviation.meteo.fr</w:t>
+        </w:r>
+      </w:hyperlink>
+    </w:p>
+    <w:p>
+      <w:pPr>
+        <w:keepLines w:val="0"/>
+      </w:pPr>
+      <w:r>
+        <w:rPr>
+          <w:rFonts w:ascii="Arial" w:hAnsi="Arial" w:eastAsia="Arial"/>
+          <w:i w:val="0"/>
+          <w:color w:val="172A34"/>
+          <w:sz w:val="17"/>
+        </w:rPr>
         <w:t xml:space="preserve">Copie publique du manuel générique DR400/180 utilisée : </w:t>
       </w:r>
-      <w:hyperlink r:id="rId20">
+      <w:hyperlink r:id="rId21">
         <w:r>
           <w:rPr>
             <w:color w:val="087F70"/>
@@ -14865,7 +14980,7 @@
         </w:rPr>
         <w:t xml:space="preserve">Fiche de type EASA DR 200/300/400 : </w:t>
       </w:r>
-      <w:hyperlink r:id="rId21">
+      <w:hyperlink r:id="rId22">
         <w:r>
           <w:rPr>
             <w:color w:val="087F70"/>

</xml_diff>

<commit_message>
Import official VAC distances and direct chart links
</commit_message>
<xml_diff>
--- a/docs/manuel-utilisation-outils-de-vol.docx
+++ b/docs/manuel-utilisation-outils-de-vol.docx
@@ -6350,7 +6350,7 @@
           <w:color w:val="172A34"/>
           <w:sz w:val="19"/>
         </w:rPr>
-        <w:t>vérifier TORA et TODA sur la VAC, l'AIP et les NOTAM. Corriger les valeurs si nécessaire.</w:t>
+        <w:t>ouvrir le lien direct « VAC officielle », puis comparer la TORA et la TODA préremplies avec la carte, l'AIP et les NOTAM. Corriger les valeurs si une information du jour modifie la distance disponible.</w:t>
       </w:r>
     </w:p>
     <w:p>
@@ -7032,7 +7032,7 @@
           <w:i w:val="0"/>
           <w:color w:val="172A34"/>
         </w:rPr>
-        <w:t>Le jeu local contient les aérodromes métropolitains du cycle AIRAC 08/26. Il reprend notamment l'altitude, les QFU, les surfaces, les dimensions, les relèvements vrais et les altitudes de seuil. Les distances déclarées TORA et TODA ne sont remplies que lorsqu'elles ont été intégrées depuis une source identifiée.</w:t>
+        <w:t>Le jeu local contient les aérodromes métropolitains du cycle AIRAC 08/26. Il reprend notamment l'altitude, les QFU, les surfaces, les dimensions, les relèvements vrais et les altitudes de seuil. Pour chaque terrain publié dans l'Atlas VAC du même cycle, le bouton ouvre directement le PDF officiel du terrain.</w:t>
       </w:r>
     </w:p>
     <w:p>
@@ -7045,7 +7045,83 @@
           <w:i w:val="0"/>
           <w:color w:val="172A34"/>
         </w:rPr>
-        <w:t>Une absence de donnée laisse le champ modifiable. La longueur physique d'une piste ne doit pas être confondue avec une TORA ou une TODA publiée.</w:t>
+        <w:t>Un import hors ligne lit la table des distances déclarées de chaque VAC. Les départs réduits depuis une intersection ou un taxiway sont écartés. Lorsque la VAC ne donne pas de colonne TORA, l'application retient prudemment la plus petite valeur entre la longueur physique, la TODA et l'ASDA. Une TORA explicitement publiée dans le texte de la VAC remplace cette valeur dérivée.</w:t>
+      </w:r>
+    </w:p>
+    <w:tbl>
+      <w:tblPr>
+        <w:tblW w:type="dxa" w:w="10035"/>
+        <w:jc w:val="left"/>
+        <w:tblLayout w:type="fixed"/>
+        <w:tblLook w:firstColumn="1" w:firstRow="1" w:lastColumn="0" w:lastRow="0" w:noHBand="0" w:noVBand="1" w:val="04A0"/>
+        <w:tblInd w:w="120" w:type="dxa"/>
+      </w:tblPr>
+      <w:tblGrid>
+        <w:gridCol w:w="10035"/>
+      </w:tblGrid>
+      <w:tr>
+        <w:trPr>
+          <w:cantSplit/>
+        </w:trPr>
+        <w:tc>
+          <w:tcPr>
+            <w:tcW w:type="dxa" w:w="10035"/>
+            <w:tcMar>
+              <w:top w:w="80" w:type="dxa"/>
+              <w:start w:w="120" w:type="dxa"/>
+              <w:bottom w:w="80" w:type="dxa"/>
+              <w:end w:w="120" w:type="dxa"/>
+            </w:tcMar>
+            <w:vAlign w:val="center"/>
+            <w:tcBorders>
+              <w:top w:val="single" w:sz="2" w:color="FBEAE7"/>
+              <w:bottom w:val="single" w:sz="2" w:color="FBEAE7"/>
+              <w:start w:val="single" w:sz="18" w:color="AA4237"/>
+              <w:end w:val="single" w:sz="2" w:color="FBEAE7"/>
+            </w:tcBorders>
+            <w:shd w:fill="FBEAE7"/>
+          </w:tcPr>
+          <w:p>
+            <w:pPr>
+              <w:spacing w:after="40"/>
+            </w:pPr>
+            <w:r>
+              <w:rPr>
+                <w:rFonts w:ascii="Arial" w:hAnsi="Arial" w:eastAsia="Arial"/>
+                <w:b/>
+                <w:color w:val="AA4237"/>
+                <w:sz w:val="17"/>
+              </w:rPr>
+              <w:t>CAS LAISSÉS VIDES</w:t>
+            </w:r>
+          </w:p>
+          <w:p>
+            <w:pPr>
+              <w:spacing w:after="0" w:line="259" w:lineRule="auto"/>
+            </w:pPr>
+            <w:r>
+              <w:rPr>
+                <w:rFonts w:ascii="Arial" w:hAnsi="Arial" w:eastAsia="Arial"/>
+                <w:color w:val="172A34"/>
+                <w:sz w:val="18"/>
+              </w:rPr>
+              <w:t>Une VAC peut publier plusieurs configurations, omettre les distances d'une bande ou indiquer NIL au décollage. Dans ces cas, l'application ne choisit pas arbitrairement : le menu signale la situation et les champs restent à compléter uniquement à partir de l'information applicable du jour.</w:t>
+            </w:r>
+          </w:p>
+        </w:tc>
+      </w:tr>
+    </w:tbl>
+    <w:p>
+      <w:pPr>
+        <w:keepLines w:val="0"/>
+        <w:spacing w:after="40"/>
+      </w:pPr>
+      <w:r>
+        <w:rPr>
+          <w:rFonts w:ascii="Arial" w:hAnsi="Arial" w:eastAsia="Arial"/>
+          <w:i w:val="0"/>
+          <w:color w:val="172A34"/>
+        </w:rPr>
       </w:r>
     </w:p>
     <w:p>
@@ -8154,7 +8230,7 @@
           <w:i w:val="0"/>
           <w:color w:val="172A34"/>
         </w:rPr>
-        <w:t>Le cycle et sa date d'effet sont affichés avec les données terrain. Un cycle absent, futur ou âgé de plus de 28 jours déclenche un avertissement. La VAC, l'AIP et les NOTAM en vigueur gardent la priorité.</w:t>
+        <w:t>Le cycle et sa date d'effet sont affichés avec les données terrain. Le catalogue et les VAC doivent être réimportés ensemble à chaque cycle. Un cycle absent, futur ou âgé de plus de 28 jours déclenche un avertissement. La VAC, l'AIP et les NOTAM en vigueur gardent la priorité.</w:t>
       </w:r>
     </w:p>
     <w:p>
@@ -8810,7 +8886,7 @@
                 <w:color w:val="172A34"/>
                 <w:sz w:val="15"/>
               </w:rPr>
-              <w:t>TORA/TODA absentes</w:t>
+              <w:t>VAC directe disponible</w:t>
             </w:r>
           </w:p>
         </w:tc>
@@ -8843,7 +8919,7 @@
                 <w:color w:val="172A34"/>
                 <w:sz w:val="15"/>
               </w:rPr>
-              <w:t>Les champs restent vides.</w:t>
+              <w:t>Le PDF officiel du terrain s'ouvre sans recherche dans l'Atlas.</w:t>
             </w:r>
           </w:p>
         </w:tc>
@@ -8876,7 +8952,215 @@
                 <w:color w:val="172A34"/>
                 <w:sz w:val="15"/>
               </w:rPr>
-              <w:t>Consulter la VAC, l'AIP et les NOTAM.</w:t>
+              <w:t>Contrôler la table et les informations du jour.</w:t>
+            </w:r>
+          </w:p>
+        </w:tc>
+      </w:tr>
+      <w:tr>
+        <w:trPr>
+          <w:cantSplit/>
+        </w:trPr>
+        <w:tc>
+          <w:tcPr>
+            <w:tcW w:type="dxa" w:w="2495"/>
+            <w:tcMar>
+              <w:top w:w="80" w:type="dxa"/>
+              <w:start w:w="120" w:type="dxa"/>
+              <w:bottom w:w="80" w:type="dxa"/>
+              <w:end w:w="120" w:type="dxa"/>
+            </w:tcMar>
+            <w:vAlign w:val="center"/>
+            <w:tcBorders>
+              <w:top w:val="single" w:sz="4" w:color="CFDCE1"/>
+              <w:bottom w:val="single" w:sz="4" w:color="CFDCE1"/>
+              <w:start w:val="single" w:sz="4" w:color="CFDCE1"/>
+              <w:end w:val="single" w:sz="4" w:color="CFDCE1"/>
+            </w:tcBorders>
+          </w:tcPr>
+          <w:p>
+            <w:pPr>
+              <w:spacing w:before="0" w:after="0" w:line="259" w:lineRule="auto"/>
+            </w:pPr>
+            <w:r/>
+            <w:r>
+              <w:rPr>
+                <w:rFonts w:ascii="Arial" w:hAnsi="Arial" w:eastAsia="Arial"/>
+                <w:b w:val="0"/>
+                <w:color w:val="172A34"/>
+                <w:sz w:val="15"/>
+              </w:rPr>
+              <w:t>VAC non publiée dans l'Atlas</w:t>
+            </w:r>
+          </w:p>
+        </w:tc>
+        <w:tc>
+          <w:tcPr>
+            <w:tcW w:type="dxa" w:w="3515"/>
+            <w:tcMar>
+              <w:top w:w="80" w:type="dxa"/>
+              <w:start w:w="120" w:type="dxa"/>
+              <w:bottom w:w="80" w:type="dxa"/>
+              <w:end w:w="120" w:type="dxa"/>
+            </w:tcMar>
+            <w:vAlign w:val="center"/>
+            <w:tcBorders>
+              <w:top w:val="single" w:sz="4" w:color="CFDCE1"/>
+              <w:bottom w:val="single" w:sz="4" w:color="CFDCE1"/>
+              <w:start w:val="single" w:sz="4" w:color="CFDCE1"/>
+              <w:end w:val="single" w:sz="4" w:color="CFDCE1"/>
+            </w:tcBorders>
+          </w:tcPr>
+          <w:p>
+            <w:pPr>
+              <w:spacing w:before="0" w:after="0" w:line="259" w:lineRule="auto"/>
+            </w:pPr>
+            <w:r/>
+            <w:r>
+              <w:rPr>
+                <w:rFonts w:ascii="Arial" w:hAnsi="Arial" w:eastAsia="Arial"/>
+                <w:b w:val="0"/>
+                <w:color w:val="172A34"/>
+                <w:sz w:val="15"/>
+              </w:rPr>
+              <w:t>Le lien ouvre le portail SIA et l'absence est signalée.</w:t>
+            </w:r>
+          </w:p>
+        </w:tc>
+        <w:tc>
+          <w:tcPr>
+            <w:tcW w:type="dxa" w:w="4025"/>
+            <w:tcMar>
+              <w:top w:w="80" w:type="dxa"/>
+              <w:start w:w="120" w:type="dxa"/>
+              <w:bottom w:w="80" w:type="dxa"/>
+              <w:end w:w="120" w:type="dxa"/>
+            </w:tcMar>
+            <w:vAlign w:val="center"/>
+            <w:tcBorders>
+              <w:top w:val="single" w:sz="4" w:color="CFDCE1"/>
+              <w:bottom w:val="single" w:sz="4" w:color="CFDCE1"/>
+              <w:start w:val="single" w:sz="4" w:color="CFDCE1"/>
+              <w:end w:val="single" w:sz="4" w:color="CFDCE1"/>
+            </w:tcBorders>
+          </w:tcPr>
+          <w:p>
+            <w:pPr>
+              <w:spacing w:before="0" w:after="0" w:line="259" w:lineRule="auto"/>
+            </w:pPr>
+            <w:r/>
+            <w:r>
+              <w:rPr>
+                <w:rFonts w:ascii="Arial" w:hAnsi="Arial" w:eastAsia="Arial"/>
+                <w:b w:val="0"/>
+                <w:color w:val="172A34"/>
+                <w:sz w:val="15"/>
+              </w:rPr>
+              <w:t>Consulter l'AIP et la documentation officielle applicable.</w:t>
+            </w:r>
+          </w:p>
+        </w:tc>
+      </w:tr>
+      <w:tr>
+        <w:trPr>
+          <w:cantSplit/>
+        </w:trPr>
+        <w:tc>
+          <w:tcPr>
+            <w:tcW w:type="dxa" w:w="2495"/>
+            <w:tcMar>
+              <w:top w:w="80" w:type="dxa"/>
+              <w:start w:w="120" w:type="dxa"/>
+              <w:bottom w:w="80" w:type="dxa"/>
+              <w:end w:w="120" w:type="dxa"/>
+            </w:tcMar>
+            <w:vAlign w:val="center"/>
+            <w:tcBorders>
+              <w:top w:val="single" w:sz="4" w:color="CFDCE1"/>
+              <w:bottom w:val="single" w:sz="4" w:color="CFDCE1"/>
+              <w:start w:val="single" w:sz="4" w:color="CFDCE1"/>
+              <w:end w:val="single" w:sz="4" w:color="CFDCE1"/>
+            </w:tcBorders>
+          </w:tcPr>
+          <w:p>
+            <w:pPr>
+              <w:spacing w:before="0" w:after="0" w:line="259" w:lineRule="auto"/>
+            </w:pPr>
+            <w:r/>
+            <w:r>
+              <w:rPr>
+                <w:rFonts w:ascii="Arial" w:hAnsi="Arial" w:eastAsia="Arial"/>
+                <w:b w:val="0"/>
+                <w:color w:val="172A34"/>
+                <w:sz w:val="15"/>
+              </w:rPr>
+              <w:t>TORA/TODA absentes ou conditionnelles</w:t>
+            </w:r>
+          </w:p>
+        </w:tc>
+        <w:tc>
+          <w:tcPr>
+            <w:tcW w:type="dxa" w:w="3515"/>
+            <w:tcMar>
+              <w:top w:w="80" w:type="dxa"/>
+              <w:start w:w="120" w:type="dxa"/>
+              <w:bottom w:w="80" w:type="dxa"/>
+              <w:end w:w="120" w:type="dxa"/>
+            </w:tcMar>
+            <w:vAlign w:val="center"/>
+            <w:tcBorders>
+              <w:top w:val="single" w:sz="4" w:color="CFDCE1"/>
+              <w:bottom w:val="single" w:sz="4" w:color="CFDCE1"/>
+              <w:start w:val="single" w:sz="4" w:color="CFDCE1"/>
+              <w:end w:val="single" w:sz="4" w:color="CFDCE1"/>
+            </w:tcBorders>
+          </w:tcPr>
+          <w:p>
+            <w:pPr>
+              <w:spacing w:before="0" w:after="0" w:line="259" w:lineRule="auto"/>
+            </w:pPr>
+            <w:r/>
+            <w:r>
+              <w:rPr>
+                <w:rFonts w:ascii="Arial" w:hAnsi="Arial" w:eastAsia="Arial"/>
+                <w:b w:val="0"/>
+                <w:color w:val="172A34"/>
+                <w:sz w:val="15"/>
+              </w:rPr>
+              <w:t>Les champs restent vides ; aucune distance n'est déduite arbitrairement.</w:t>
+            </w:r>
+          </w:p>
+        </w:tc>
+        <w:tc>
+          <w:tcPr>
+            <w:tcW w:type="dxa" w:w="4025"/>
+            <w:tcMar>
+              <w:top w:w="80" w:type="dxa"/>
+              <w:start w:w="120" w:type="dxa"/>
+              <w:bottom w:w="80" w:type="dxa"/>
+              <w:end w:w="120" w:type="dxa"/>
+            </w:tcMar>
+            <w:vAlign w:val="center"/>
+            <w:tcBorders>
+              <w:top w:val="single" w:sz="4" w:color="CFDCE1"/>
+              <w:bottom w:val="single" w:sz="4" w:color="CFDCE1"/>
+              <w:start w:val="single" w:sz="4" w:color="CFDCE1"/>
+              <w:end w:val="single" w:sz="4" w:color="CFDCE1"/>
+            </w:tcBorders>
+          </w:tcPr>
+          <w:p>
+            <w:pPr>
+              <w:spacing w:before="0" w:after="0" w:line="259" w:lineRule="auto"/>
+            </w:pPr>
+            <w:r/>
+            <w:r>
+              <w:rPr>
+                <w:rFonts w:ascii="Arial" w:hAnsi="Arial" w:eastAsia="Arial"/>
+                <w:b w:val="0"/>
+                <w:color w:val="172A34"/>
+                <w:sz w:val="15"/>
+              </w:rPr>
+              <w:t>Appliquer uniquement la configuration publiée et en service.</w:t>
             </w:r>
           </w:p>
         </w:tc>
@@ -13329,7 +13613,7 @@
           <w:i w:val="0"/>
           <w:color w:val="172A34"/>
         </w:rPr>
-        <w:t>Le fichier local est généré à partir du catalogue SIA AD 1.3 / AIXM du cycle AIRAC 08/26. Il contient 432 aérodromes métropolitains et 1 349 entrées directionnelles. LFRQ et LFMW disposent en plus de distances déclarées intégrées depuis leur documentation courante.</w:t>
+        <w:t>Le fichier local est généré à partir du catalogue SIA AD 1.3 / AIXM et des VAC du cycle AIRAC 08/26. Il contient 432 aérodromes métropolitains et 1 349 entrées directionnelles. Une VAC directe est disponible pour 420 terrains ; 1 247 QFU disposent d'une TORA/TODA exploitable et un QFU est explicitement indiqué NIL au décollage. Les autres entrées correspondent notamment à des bandes non publiées dans la table ou à des configurations conditionnelles.</w:t>
       </w:r>
     </w:p>
     <w:p>
@@ -13342,7 +13626,7 @@
           <w:i w:val="0"/>
           <w:color w:val="172A34"/>
         </w:rPr>
-        <w:t>À titre de contrôle : LFRQ, altitude 297 ft, QFU 09/27, asphalte, 2 150 x 45 m ; TORA/TODA 09 : 2 150/2 150 m et 27 : 2 113/2 113 m. LFMW, altitude 553 ft, QFU 11/29, piste revêtue 810 x 30 m ; TORA/TODA 810/810 m.</w:t>
+        <w:t>À titre de contrôle : LFRN reprend les six entrées 10, 28, 14, 32, 14L et 32R sans mélanger la piste revêtue et la bande non revêtue ; LFPN 25L reprend la TORA explicitement publiée de 945 m ; les distances réduites depuis les taxiways sont exclues. LFRQ conserve TORA/TODA 09 : 2 150/2 150 m et 27 : 2 113/2 113 m.</w:t>
       </w:r>
     </w:p>
     <w:p>
@@ -13504,6 +13788,14 @@
       </w:pPr>
       <w:r>
         <w:t>Définir et appliquer une procédure de mise à jour du jeu SIA tous les 28 jours.</w:t>
+      </w:r>
+    </w:p>
+    <w:p>
+      <w:pPr>
+        <w:pStyle w:val="ManualBullet"/>
+      </w:pPr>
+      <w:r>
+        <w:t>Réimporter le catalogue AD 1.3 et les VAC du même cycle, puis contrôler le rapport d'audit avant publication.</w:t>
       </w:r>
     </w:p>
     <w:p>

</xml_diff>